<commit_message>
Add human escalation requirements to PRD
Add tenant and reviewer escalation requirements, an escalation metric,
an Escalation to a human appendix section, and an open question on who
receives escalations.

Co-Authored-By: Claude Sonnet 5.5 <noreply@anthropic.com>
</commit_message>
<xml_diff>
--- a/HeatWatch PRD.docx
+++ b/HeatWatch PRD.docx
@@ -2599,7 +2599,7 @@
                 <w:color w:val="4a4a4a"/>
                 <w:rtl w:val="0"/>
               </w:rPr>
-              <w:t xml:space="preserve">Accurate quoted timelines</w:t>
+              <w:t xml:space="preserve">Qualifying cases reach a person</w:t>
             </w:r>
             <w:r>
               <w:rPr>
@@ -2639,7 +2639,7 @@
                 <w:color w:val="4a4a4a"/>
                 <w:rtl w:val="0"/>
               </w:rPr>
-              <w:t xml:space="preserve">Closed tickets resolve inside the quoted window</w:t>
+              <w:t xml:space="preserve">Tickets meeting an escalation rule are handed to a human reviewer</w:t>
             </w:r>
             <w:r>
               <w:rPr>
@@ -2679,7 +2679,7 @@
                 <w:color w:val="4a4a4a"/>
                 <w:rtl w:val="0"/>
               </w:rPr>
-              <w:t xml:space="preserve">% of closed tickets resolved within the quoted ETA window (baseline p90 about 84 hours)</w:t>
+              <w:t xml:space="preserve">% of tickets meeting an escalation rule that are escalated, with the reason shown, within 15 minutes</w:t>
             </w:r>
             <w:r>
               <w:rPr>
@@ -2719,6 +2719,172 @@
                 <w:color w:val="4a4a4a"/>
                 <w:rtl w:val="0"/>
               </w:rPr>
+              <w:t xml:space="preserve">≥ 95%</w:t>
+            </w:r>
+            <w:r>
+              <w:rPr>
+                <w:rtl w:val="0"/>
+              </w:rPr>
+            </w:r>
+          </w:p>
+        </w:tc>
+      </w:tr>
+      <w:tr>
+        <w:trPr>
+          <w:cantSplit w:val="0"/>
+          <w:tblHeader w:val="0"/>
+        </w:trPr>
+        <w:tc>
+          <w:tcPr>
+            <w:tcBorders>
+              <w:top w:color="cccccc" w:space="0" w:sz="4" w:val="single"/>
+              <w:left w:color="cccccc" w:space="0" w:sz="4" w:val="single"/>
+              <w:bottom w:color="cccccc" w:space="0" w:sz="4" w:val="single"/>
+              <w:right w:color="cccccc" w:space="0" w:sz="4" w:val="single"/>
+            </w:tcBorders>
+            <w:shd w:fill="ffffff" w:val="clear"/>
+            <w:tcMar>
+              <w:top w:w="80.0" w:type="dxa"/>
+              <w:left w:w="120.0" w:type="dxa"/>
+              <w:bottom w:w="80.0" w:type="dxa"/>
+              <w:right w:w="120.0" w:type="dxa"/>
+            </w:tcMar>
+          </w:tcPr>
+          <w:p>
+            <w:pPr>
+              <w:spacing w:line="240" w:lineRule="auto"/>
+              <w:rPr>
+                <w:rFonts w:ascii="Calibri" w:cs="Calibri" w:eastAsia="Calibri" w:hAnsi="Calibri"/>
+                <w:sz w:val="22"/>
+                <w:szCs w:val="22"/>
+              </w:rPr>
+            </w:pPr>
+            <w:r>
+              <w:rPr>
+                <w:rFonts w:ascii="Calibri" w:cs="Calibri" w:eastAsia="Calibri" w:hAnsi="Calibri"/>
+                <w:color w:val="4a4a4a"/>
+                <w:rtl w:val="0"/>
+              </w:rPr>
+              <w:t xml:space="preserve">Accurate quoted timelines</w:t>
+            </w:r>
+            <w:r>
+              <w:rPr>
+                <w:rtl w:val="0"/>
+              </w:rPr>
+            </w:r>
+          </w:p>
+        </w:tc>
+        <w:tc>
+          <w:tcPr>
+            <w:tcBorders>
+              <w:top w:color="cccccc" w:space="0" w:sz="4" w:val="single"/>
+              <w:left w:color="cccccc" w:space="0" w:sz="4" w:val="single"/>
+              <w:bottom w:color="cccccc" w:space="0" w:sz="4" w:val="single"/>
+              <w:right w:color="cccccc" w:space="0" w:sz="4" w:val="single"/>
+            </w:tcBorders>
+            <w:shd w:fill="ffffff" w:val="clear"/>
+            <w:tcMar>
+              <w:top w:w="80.0" w:type="dxa"/>
+              <w:left w:w="120.0" w:type="dxa"/>
+              <w:bottom w:w="80.0" w:type="dxa"/>
+              <w:right w:w="120.0" w:type="dxa"/>
+            </w:tcMar>
+          </w:tcPr>
+          <w:p>
+            <w:pPr>
+              <w:spacing w:line="240" w:lineRule="auto"/>
+              <w:rPr>
+                <w:rFonts w:ascii="Calibri" w:cs="Calibri" w:eastAsia="Calibri" w:hAnsi="Calibri"/>
+                <w:sz w:val="22"/>
+                <w:szCs w:val="22"/>
+              </w:rPr>
+            </w:pPr>
+            <w:r>
+              <w:rPr>
+                <w:rFonts w:ascii="Calibri" w:cs="Calibri" w:eastAsia="Calibri" w:hAnsi="Calibri"/>
+                <w:color w:val="4a4a4a"/>
+                <w:rtl w:val="0"/>
+              </w:rPr>
+              <w:t xml:space="preserve">Closed tickets resolve inside the quoted window</w:t>
+            </w:r>
+            <w:r>
+              <w:rPr>
+                <w:rtl w:val="0"/>
+              </w:rPr>
+            </w:r>
+          </w:p>
+        </w:tc>
+        <w:tc>
+          <w:tcPr>
+            <w:tcBorders>
+              <w:top w:color="cccccc" w:space="0" w:sz="4" w:val="single"/>
+              <w:left w:color="cccccc" w:space="0" w:sz="4" w:val="single"/>
+              <w:bottom w:color="cccccc" w:space="0" w:sz="4" w:val="single"/>
+              <w:right w:color="cccccc" w:space="0" w:sz="4" w:val="single"/>
+            </w:tcBorders>
+            <w:shd w:fill="ffffff" w:val="clear"/>
+            <w:tcMar>
+              <w:top w:w="80.0" w:type="dxa"/>
+              <w:left w:w="120.0" w:type="dxa"/>
+              <w:bottom w:w="80.0" w:type="dxa"/>
+              <w:right w:w="120.0" w:type="dxa"/>
+            </w:tcMar>
+          </w:tcPr>
+          <w:p>
+            <w:pPr>
+              <w:spacing w:line="240" w:lineRule="auto"/>
+              <w:rPr>
+                <w:rFonts w:ascii="Calibri" w:cs="Calibri" w:eastAsia="Calibri" w:hAnsi="Calibri"/>
+                <w:sz w:val="22"/>
+                <w:szCs w:val="22"/>
+              </w:rPr>
+            </w:pPr>
+            <w:r>
+              <w:rPr>
+                <w:rFonts w:ascii="Calibri" w:cs="Calibri" w:eastAsia="Calibri" w:hAnsi="Calibri"/>
+                <w:color w:val="4a4a4a"/>
+                <w:rtl w:val="0"/>
+              </w:rPr>
+              <w:t xml:space="preserve">% of closed tickets resolved within the quoted ETA window (baseline p90 about 84 hours)</w:t>
+            </w:r>
+            <w:r>
+              <w:rPr>
+                <w:rtl w:val="0"/>
+              </w:rPr>
+            </w:r>
+          </w:p>
+        </w:tc>
+        <w:tc>
+          <w:tcPr>
+            <w:tcBorders>
+              <w:top w:color="cccccc" w:space="0" w:sz="4" w:val="single"/>
+              <w:left w:color="cccccc" w:space="0" w:sz="4" w:val="single"/>
+              <w:bottom w:color="cccccc" w:space="0" w:sz="4" w:val="single"/>
+              <w:right w:color="cccccc" w:space="0" w:sz="4" w:val="single"/>
+            </w:tcBorders>
+            <w:shd w:fill="ffffff" w:val="clear"/>
+            <w:tcMar>
+              <w:top w:w="80.0" w:type="dxa"/>
+              <w:left w:w="120.0" w:type="dxa"/>
+              <w:bottom w:w="80.0" w:type="dxa"/>
+              <w:right w:w="120.0" w:type="dxa"/>
+            </w:tcMar>
+          </w:tcPr>
+          <w:p>
+            <w:pPr>
+              <w:spacing w:line="240" w:lineRule="auto"/>
+              <w:rPr>
+                <w:rFonts w:ascii="Calibri" w:cs="Calibri" w:eastAsia="Calibri" w:hAnsi="Calibri"/>
+                <w:sz w:val="22"/>
+                <w:szCs w:val="22"/>
+              </w:rPr>
+            </w:pPr>
+            <w:r>
+              <w:rPr>
+                <w:rFonts w:ascii="Calibri" w:cs="Calibri" w:eastAsia="Calibri" w:hAnsi="Calibri"/>
+                <w:color w:val="4a4a4a"/>
+                <w:rtl w:val="0"/>
+              </w:rPr>
               <w:t xml:space="preserve">≥ 85%</w:t>
             </w:r>
             <w:r>
@@ -3669,6 +3835,48 @@
           <w:rFonts w:ascii="Calibri" w:cs="Calibri" w:eastAsia="Calibri" w:hAnsi="Calibri"/>
           <w:b w:val="1"/>
           <w:bCs w:val="1"/>
+          <w:color w:val="c0392b"/>
+          <w:sz w:val="22"/>
+          <w:szCs w:val="22"/>
+          <w:rtl w:val="0"/>
+        </w:rPr>
+        <w:t xml:space="preserve">[P0]  </w:t>
+      </w:r>
+      <w:r>
+        <w:rPr>
+          <w:rFonts w:ascii="Calibri" w:cs="Calibri" w:eastAsia="Calibri" w:hAnsi="Calibri"/>
+          <w:color w:val="4a4a4a"/>
+          <w:sz w:val="22"/>
+          <w:szCs w:val="22"/>
+          <w:rtl w:val="0"/>
+        </w:rPr>
+        <w:t xml:space="preserve">User is told when their case has been escalated to a person and what to expect next.</w:t>
+      </w:r>
+      <w:r>
+        <w:rPr>
+          <w:rtl w:val="0"/>
+        </w:rPr>
+      </w:r>
+    </w:p>
+    <w:p>
+      <w:pPr>
+        <w:numPr>
+          <w:ilvl w:val="1"/>
+          <w:numId w:val="1"/>
+        </w:numPr>
+        <w:spacing w:after="60" w:line="240" w:lineRule="auto"/>
+        <w:ind w:left="720" w:hanging="360"/>
+        <w:rPr>
+          <w:rFonts w:ascii="Calibri" w:cs="Calibri" w:eastAsia="Calibri" w:hAnsi="Calibri"/>
+          <w:sz w:val="22"/>
+          <w:szCs w:val="22"/>
+        </w:rPr>
+      </w:pPr>
+      <w:r>
+        <w:rPr>
+          <w:rFonts w:ascii="Calibri" w:cs="Calibri" w:eastAsia="Calibri" w:hAnsi="Calibri"/>
+          <w:b w:val="1"/>
+          <w:bCs w:val="1"/>
           <w:color w:val="1a6b2a"/>
           <w:sz w:val="22"/>
           <w:szCs w:val="22"/>
@@ -4400,6 +4608,48 @@
           <w:rtl w:val="0"/>
         </w:rPr>
         <w:t xml:space="preserve">Reviewer can see open tickets ranked by urgency.</w:t>
+      </w:r>
+      <w:r>
+        <w:rPr>
+          <w:rtl w:val="0"/>
+        </w:rPr>
+      </w:r>
+    </w:p>
+    <w:p>
+      <w:pPr>
+        <w:numPr>
+          <w:ilvl w:val="1"/>
+          <w:numId w:val="1"/>
+        </w:numPr>
+        <w:spacing w:after="60" w:line="240" w:lineRule="auto"/>
+        <w:ind w:left="720" w:hanging="360"/>
+        <w:rPr>
+          <w:rFonts w:ascii="Calibri" w:cs="Calibri" w:eastAsia="Calibri" w:hAnsi="Calibri"/>
+          <w:sz w:val="22"/>
+          <w:szCs w:val="22"/>
+        </w:rPr>
+      </w:pPr>
+      <w:r>
+        <w:rPr>
+          <w:rFonts w:ascii="Calibri" w:cs="Calibri" w:eastAsia="Calibri" w:hAnsi="Calibri"/>
+          <w:b w:val="1"/>
+          <w:bCs w:val="1"/>
+          <w:color w:val="c0392b"/>
+          <w:sz w:val="22"/>
+          <w:szCs w:val="22"/>
+          <w:rtl w:val="0"/>
+        </w:rPr>
+        <w:t xml:space="preserve">[P0]  </w:t>
+      </w:r>
+      <w:r>
+        <w:rPr>
+          <w:rFonts w:ascii="Calibri" w:cs="Calibri" w:eastAsia="Calibri" w:hAnsi="Calibri"/>
+          <w:color w:val="4a4a4a"/>
+          <w:sz w:val="22"/>
+          <w:szCs w:val="22"/>
+          <w:rtl w:val="0"/>
+        </w:rPr>
+        <w:t xml:space="preserve">Reviewer is alerted when a ticket meets an escalation rule (see Appendix) and can see the reason.</w:t>
       </w:r>
       <w:r>
         <w:rPr>
@@ -5118,7 +5368,32 @@
           <w:szCs w:val="22"/>
           <w:rtl w:val="0"/>
         </w:rPr>
-        <w:t xml:space="preserve">Constraints and data gaps</w:t>
+        <w:t xml:space="preserve">Escalation to a human</w:t>
+      </w:r>
+    </w:p>
+    <w:p>
+      <w:pPr>
+        <w:spacing w:after="80" w:line="240" w:lineRule="auto"/>
+        <w:rPr>
+          <w:rFonts w:ascii="Calibri" w:cs="Calibri" w:eastAsia="Calibri" w:hAnsi="Calibri"/>
+          <w:sz w:val="22"/>
+          <w:szCs w:val="22"/>
+        </w:rPr>
+      </w:pPr>
+      <w:r>
+        <w:rPr>
+          <w:rFonts w:ascii="Calibri" w:cs="Calibri" w:eastAsia="Calibri" w:hAnsi="Calibri"/>
+          <w:color w:val="4a4a4a"/>
+          <w:sz w:val="22"/>
+          <w:szCs w:val="22"/>
+          <w:rtl w:val="0"/>
+        </w:rPr>
+        <w:t xml:space="preserve">The agent hands a ticket to a human reviewer (an operator or partner advocate) when any of these is true:</w:t>
+      </w:r>
+      <w:r>
+        <w:rPr>
+          <w:rtl w:val="0"/>
+        </w:rPr>
       </w:r>
     </w:p>
     <w:p>
@@ -5143,7 +5418,7 @@
           <w:szCs w:val="22"/>
           <w:rtl w:val="0"/>
         </w:rPr>
-        <w:t xml:space="preserve">The public data has only open or closed status, so intermediate ticket stages are HeatWatch’s own.</w:t>
+        <w:t xml:space="preserve">Safety risk, or a vulnerable household (infant, older adult, medical need) with no heat: immediately, together with the emergency-services referral.</w:t>
       </w:r>
       <w:r>
         <w:rPr>
@@ -5173,7 +5448,7 @@
           <w:szCs w:val="22"/>
           <w:rtl w:val="0"/>
         </w:rPr>
-        <w:t xml:space="preserve">No due date is recorded and the dataset refreshes about daily, so outcomes lag.</w:t>
+        <w:t xml:space="preserve">Whole-building outage during heat season (October 1 to May 31), especially overnight.</w:t>
       </w:r>
       <w:r>
         <w:rPr>
@@ -5203,7 +5478,7 @@
           <w:szCs w:val="22"/>
           <w:rtl w:val="0"/>
         </w:rPr>
-        <w:t xml:space="preserve">Some open records are stale (the oldest open complaint dates from 2024-10-13).</w:t>
+        <w:t xml:space="preserve">Ticket is overdue against its quoted window (the 90th percentile close time is about 84 hours).</w:t>
       </w:r>
       <w:r>
         <w:rPr>
@@ -5233,7 +5508,67 @@
           <w:szCs w:val="22"/>
           <w:rtl w:val="0"/>
         </w:rPr>
-        <w:t xml:space="preserve">The data has no building ownership field, so NYCHA or other non-HPD buildings cannot be identified from it.</w:t>
+        <w:t xml:space="preserve">Ticket is reopened, or the tenant reports the problem continues after closure.</w:t>
+      </w:r>
+      <w:r>
+        <w:rPr>
+          <w:rtl w:val="0"/>
+        </w:rPr>
+      </w:r>
+    </w:p>
+    <w:p>
+      <w:pPr>
+        <w:numPr>
+          <w:ilvl w:val="0"/>
+          <w:numId w:val="1"/>
+        </w:numPr>
+        <w:spacing w:after="60" w:line="240" w:lineRule="auto"/>
+        <w:ind w:left="360"/>
+        <w:rPr>
+          <w:rFonts w:ascii="Calibri" w:cs="Calibri" w:eastAsia="Calibri" w:hAnsi="Calibri"/>
+          <w:sz w:val="22"/>
+          <w:szCs w:val="22"/>
+        </w:rPr>
+      </w:pPr>
+      <w:r>
+        <w:rPr>
+          <w:rFonts w:ascii="Calibri" w:cs="Calibri" w:eastAsia="Calibri" w:hAnsi="Calibri"/>
+          <w:color w:val="4a4a4a"/>
+          <w:sz w:val="22"/>
+          <w:szCs w:val="22"/>
+          <w:rtl w:val="0"/>
+        </w:rPr>
+        <w:t xml:space="preserve">Address is on the repeat-offender list (top complaint counts).</w:t>
+      </w:r>
+      <w:r>
+        <w:rPr>
+          <w:rtl w:val="0"/>
+        </w:rPr>
+      </w:r>
+    </w:p>
+    <w:p>
+      <w:pPr>
+        <w:numPr>
+          <w:ilvl w:val="0"/>
+          <w:numId w:val="1"/>
+        </w:numPr>
+        <w:spacing w:after="60" w:line="240" w:lineRule="auto"/>
+        <w:ind w:left="360"/>
+        <w:rPr>
+          <w:rFonts w:ascii="Calibri" w:cs="Calibri" w:eastAsia="Calibri" w:hAnsi="Calibri"/>
+          <w:sz w:val="22"/>
+          <w:szCs w:val="22"/>
+        </w:rPr>
+      </w:pPr>
+      <w:r>
+        <w:rPr>
+          <w:rFonts w:ascii="Calibri" w:cs="Calibri" w:eastAsia="Calibri" w:hAnsi="Calibri"/>
+          <w:color w:val="4a4a4a"/>
+          <w:sz w:val="22"/>
+          <w:szCs w:val="22"/>
+          <w:rtl w:val="0"/>
+        </w:rPr>
+        <w:t xml:space="preserve">Low confidence or out of scope: address outside Community Board 12, a likely NYCHA building, an unclassifiable complaint, or a tenant who disputes the reply.</w:t>
       </w:r>
       <w:r>
         <w:rPr>
@@ -5262,7 +5597,181 @@
           <w:szCs w:val="22"/>
           <w:rtl w:val="0"/>
         </w:rPr>
+        <w:t xml:space="preserve">Constraints and data gaps</w:t>
+      </w:r>
+    </w:p>
+    <w:p>
+      <w:pPr>
+        <w:numPr>
+          <w:ilvl w:val="0"/>
+          <w:numId w:val="1"/>
+        </w:numPr>
+        <w:spacing w:after="60" w:line="240" w:lineRule="auto"/>
+        <w:ind w:left="360"/>
+        <w:rPr>
+          <w:rFonts w:ascii="Calibri" w:cs="Calibri" w:eastAsia="Calibri" w:hAnsi="Calibri"/>
+          <w:sz w:val="22"/>
+          <w:szCs w:val="22"/>
+        </w:rPr>
+      </w:pPr>
+      <w:r>
+        <w:rPr>
+          <w:rFonts w:ascii="Calibri" w:cs="Calibri" w:eastAsia="Calibri" w:hAnsi="Calibri"/>
+          <w:color w:val="4a4a4a"/>
+          <w:sz w:val="22"/>
+          <w:szCs w:val="22"/>
+          <w:rtl w:val="0"/>
+        </w:rPr>
+        <w:t xml:space="preserve">The public data has only open or closed status, so intermediate ticket stages are HeatWatch’s own.</w:t>
+      </w:r>
+      <w:r>
+        <w:rPr>
+          <w:rtl w:val="0"/>
+        </w:rPr>
+      </w:r>
+    </w:p>
+    <w:p>
+      <w:pPr>
+        <w:numPr>
+          <w:ilvl w:val="0"/>
+          <w:numId w:val="1"/>
+        </w:numPr>
+        <w:spacing w:after="60" w:line="240" w:lineRule="auto"/>
+        <w:ind w:left="360"/>
+        <w:rPr>
+          <w:rFonts w:ascii="Calibri" w:cs="Calibri" w:eastAsia="Calibri" w:hAnsi="Calibri"/>
+          <w:sz w:val="22"/>
+          <w:szCs w:val="22"/>
+        </w:rPr>
+      </w:pPr>
+      <w:r>
+        <w:rPr>
+          <w:rFonts w:ascii="Calibri" w:cs="Calibri" w:eastAsia="Calibri" w:hAnsi="Calibri"/>
+          <w:color w:val="4a4a4a"/>
+          <w:sz w:val="22"/>
+          <w:szCs w:val="22"/>
+          <w:rtl w:val="0"/>
+        </w:rPr>
+        <w:t xml:space="preserve">No due date is recorded and the dataset refreshes about daily, so outcomes lag.</w:t>
+      </w:r>
+      <w:r>
+        <w:rPr>
+          <w:rtl w:val="0"/>
+        </w:rPr>
+      </w:r>
+    </w:p>
+    <w:p>
+      <w:pPr>
+        <w:numPr>
+          <w:ilvl w:val="0"/>
+          <w:numId w:val="1"/>
+        </w:numPr>
+        <w:spacing w:after="60" w:line="240" w:lineRule="auto"/>
+        <w:ind w:left="360"/>
+        <w:rPr>
+          <w:rFonts w:ascii="Calibri" w:cs="Calibri" w:eastAsia="Calibri" w:hAnsi="Calibri"/>
+          <w:sz w:val="22"/>
+          <w:szCs w:val="22"/>
+        </w:rPr>
+      </w:pPr>
+      <w:r>
+        <w:rPr>
+          <w:rFonts w:ascii="Calibri" w:cs="Calibri" w:eastAsia="Calibri" w:hAnsi="Calibri"/>
+          <w:color w:val="4a4a4a"/>
+          <w:sz w:val="22"/>
+          <w:szCs w:val="22"/>
+          <w:rtl w:val="0"/>
+        </w:rPr>
+        <w:t xml:space="preserve">Some open records are stale (the oldest open complaint dates from 2024-10-13).</w:t>
+      </w:r>
+      <w:r>
+        <w:rPr>
+          <w:rtl w:val="0"/>
+        </w:rPr>
+      </w:r>
+    </w:p>
+    <w:p>
+      <w:pPr>
+        <w:numPr>
+          <w:ilvl w:val="0"/>
+          <w:numId w:val="1"/>
+        </w:numPr>
+        <w:spacing w:after="60" w:line="240" w:lineRule="auto"/>
+        <w:ind w:left="360"/>
+        <w:rPr>
+          <w:rFonts w:ascii="Calibri" w:cs="Calibri" w:eastAsia="Calibri" w:hAnsi="Calibri"/>
+          <w:sz w:val="22"/>
+          <w:szCs w:val="22"/>
+        </w:rPr>
+      </w:pPr>
+      <w:r>
+        <w:rPr>
+          <w:rFonts w:ascii="Calibri" w:cs="Calibri" w:eastAsia="Calibri" w:hAnsi="Calibri"/>
+          <w:color w:val="4a4a4a"/>
+          <w:sz w:val="22"/>
+          <w:szCs w:val="22"/>
+          <w:rtl w:val="0"/>
+        </w:rPr>
+        <w:t xml:space="preserve">The data has no building ownership field, so NYCHA or other non-HPD buildings cannot be identified from it.</w:t>
+      </w:r>
+      <w:r>
+        <w:rPr>
+          <w:rtl w:val="0"/>
+        </w:rPr>
+      </w:r>
+    </w:p>
+    <w:p>
+      <w:pPr>
+        <w:pStyle w:val="Heading3"/>
+        <w:keepNext w:val="0"/>
+        <w:keepLines w:val="0"/>
+        <w:spacing w:after="60" w:before="160" w:line="240" w:lineRule="auto"/>
+        <w:rPr>
+          <w:rFonts w:ascii="Calibri" w:cs="Calibri" w:eastAsia="Calibri" w:hAnsi="Calibri"/>
+          <w:color w:val="1a1a1a"/>
+          <w:sz w:val="22"/>
+          <w:szCs w:val="22"/>
+        </w:rPr>
+      </w:pPr>
+      <w:r>
+        <w:rPr>
+          <w:rFonts w:ascii="Calibri" w:cs="Calibri" w:eastAsia="Calibri" w:hAnsi="Calibri"/>
+          <w:color w:val="1a1a1a"/>
+          <w:sz w:val="22"/>
+          <w:szCs w:val="22"/>
+          <w:rtl w:val="0"/>
+        </w:rPr>
         <w:t xml:space="preserve">Open questions</w:t>
+      </w:r>
+    </w:p>
+    <w:p>
+      <w:pPr>
+        <w:numPr>
+          <w:ilvl w:val="0"/>
+          <w:numId w:val="1"/>
+        </w:numPr>
+        <w:spacing w:after="60" w:line="240" w:lineRule="auto"/>
+        <w:ind w:left="360"/>
+        <w:rPr>
+          <w:rFonts w:ascii="Calibri" w:cs="Calibri" w:eastAsia="Calibri" w:hAnsi="Calibri"/>
+          <w:sz w:val="22"/>
+          <w:szCs w:val="22"/>
+        </w:rPr>
+      </w:pPr>
+      <w:r>
+        <w:rPr>
+          <w:rFonts w:ascii="Calibri" w:cs="Calibri" w:eastAsia="Calibri" w:hAnsi="Calibri"/>
+          <w:color w:val="4a4a4a"/>
+          <w:sz w:val="22"/>
+          <w:szCs w:val="22"/>
+          <w:rtl w:val="0"/>
+        </w:rPr>
+        <w:t xml:space="preserve">Who is the human that receives escalations (HeatWatch operator, partner advocate, or an HPD contact), and what are they able to do?</w:t>
+      </w:r>
+      <w:r>
+        <w:rPr>
+          <w:rtl w:val="0"/>
+        </w:rPr>
       </w:r>
     </w:p>
     <w:p>

</xml_diff>